<commit_message>
Carta de servicio como la real: columna PLAZO DE EJECUCIÓN antes de la cantidad, sin unidad ni marca, y "orden de servicio"
Co-Authored-By: Claude Opus 5.5 <noreply@anthropic.com>
Claude-Session: https://claude.ai/code/session_01VvZRKa2ucnJT1PYFgmwrK2
</commit_message>
<xml_diff>
--- a/plantilla/CARTA_URGENTE.docx
+++ b/plantilla/CARTA_URGENTE.docx
@@ -640,8 +640,8 @@
       </w:tblPr>
       <w:tblGrid>
         <w:gridCol w:w="1500"/>
-        <w:gridCol w:w="2704"/>
-        <w:gridCol w:w="900"/>
+        <w:gridCol w:w="2604"/>
+        <w:gridCol w:w="1000"/>
         <w:gridCol w:w="1100"/>
         <w:gridCol w:w="1150"/>
         <w:gridCol w:w="1150"/>
@@ -677,7 +677,7 @@
         </w:tc>
         <w:tc>
           <w:tcPr>
-            <w:tcW w:w="2704" w:type="dxa"/>
+            <w:tcW w:w="2604" w:type="dxa"/>
             <w:shd w:val="clear" w:color="auto" w:fill="BDD6EE"/>
             <w:vAlign w:val="center"/>
           </w:tcPr>
@@ -705,7 +705,7 @@
         </w:tc>
         <w:tc>
           <w:tcPr>
-            <w:tcW w:w="900" w:type="dxa"/>
+            <w:tcW w:w="1000" w:type="dxa"/>
             <w:shd w:val="clear" w:color="auto" w:fill="BDD6EE"/>
             <w:vAlign w:val="center"/>
           </w:tcPr>
@@ -727,7 +727,7 @@
                 <w:sz w:val="18"/>
                 <w:szCs w:val="18"/>
               </w:rPr>
-              <w:t xml:space="preserve">CANTIDAD</w:t>
+              <w:t xml:space="preserve">{hdr3}</w:t>
             </w:r>
           </w:p>
         </w:tc>
@@ -755,7 +755,7 @@
                 <w:sz w:val="18"/>
                 <w:szCs w:val="18"/>
               </w:rPr>
-              <w:t xml:space="preserve">UNIDAD DE MEDIDA</w:t>
+              <w:t xml:space="preserve">{hdr4}</w:t>
             </w:r>
           </w:p>
         </w:tc>
@@ -844,7 +844,7 @@
         </w:tc>
         <w:tc>
           <w:tcPr>
-            <w:tcW w:w="2704" w:type="dxa"/>
+            <w:tcW w:w="2604" w:type="dxa"/>
             <w:vAlign w:val="center"/>
           </w:tcPr>
           <w:p>
@@ -869,7 +869,7 @@
         </w:tc>
         <w:tc>
           <w:tcPr>
-            <w:tcW w:w="900" w:type="dxa"/>
+            <w:tcW w:w="1000" w:type="dxa"/>
             <w:vAlign w:val="center"/>
           </w:tcPr>
           <w:p>
@@ -888,7 +888,7 @@
                 <w:sz w:val="16"/>
                 <w:szCs w:val="16"/>
               </w:rPr>
-              <w:t xml:space="preserve">{cantidad}</w:t>
+              <w:t xml:space="preserve">{c3}</w:t>
             </w:r>
           </w:p>
         </w:tc>
@@ -913,7 +913,7 @@
                 <w:sz w:val="16"/>
                 <w:szCs w:val="16"/>
               </w:rPr>
-              <w:t xml:space="preserve">{unidad}</w:t>
+              <w:t xml:space="preserve">{c4}</w:t>
             </w:r>
           </w:p>
         </w:tc>
@@ -1061,7 +1061,7 @@
           <w:sz w:val="18"/>
           <w:szCs w:val="18"/>
         </w:rPr>
-        <w:t xml:space="preserve">orden de compra</w:t>
+        <w:t xml:space="preserve">{orden}</w:t>
       </w:r>
       <w:r>
         <w:rPr>

</xml_diff>